<commit_message>
Tuan 01: Bo Sung JWT
</commit_message>
<xml_diff>
--- a/Tuan_01/22669281_NguyenHuuSang_Tuan01.docx
+++ b/Tuan_01/22669281_NguyenHuuSang_Tuan01.docx
@@ -34,7 +34,7 @@
                     <pic:cNvPicPr/>
                   </pic:nvPicPr>
                   <pic:blipFill>
-                    <a:blip r:embed="rId5" cstate="print">
+                    <a:blip r:embed="rId7" cstate="print">
                       <a:extLst>
                         <a:ext uri="{28A0092B-C50C-407E-A947-70E740481C1C}">
                           <a14:useLocalDpi xmlns:a14="http://schemas.microsoft.com/office/drawing/2010/main" val="0"/>
@@ -575,7 +575,7 @@
       </w:pPr>
       <w:r>
         <w:lastRenderedPageBreak/>
-        <w:t>Tuần 1</w:t>
+        <w:t>Message Queue</w:t>
       </w:r>
     </w:p>
     <w:p>
@@ -591,6 +591,9 @@
         <w:pStyle w:val="Image"/>
       </w:pPr>
       <w:r>
+        <w:rPr>
+          <w:noProof/>
+        </w:rPr>
         <w:drawing>
           <wp:inline distT="0" distB="0" distL="0" distR="0" wp14:anchorId="24132BB6" wp14:editId="6312370E">
             <wp:extent cx="5579745" cy="2964180"/>
@@ -604,105 +607,6 @@
                 <pic:pic xmlns:pic="http://schemas.openxmlformats.org/drawingml/2006/picture">
                   <pic:nvPicPr>
                     <pic:cNvPr id="1443810751" name=""/>
-                    <pic:cNvPicPr/>
-                  </pic:nvPicPr>
-                  <pic:blipFill>
-                    <a:blip r:embed="rId6"/>
-                    <a:stretch>
-                      <a:fillRect/>
-                    </a:stretch>
-                  </pic:blipFill>
-                  <pic:spPr>
-                    <a:xfrm>
-                      <a:off x="0" y="0"/>
-                      <a:ext cx="5579745" cy="2964180"/>
-                    </a:xfrm>
-                    <a:prstGeom prst="rect">
-                      <a:avLst/>
-                    </a:prstGeom>
-                  </pic:spPr>
-                </pic:pic>
-              </a:graphicData>
-            </a:graphic>
-          </wp:inline>
-        </w:drawing>
-      </w:r>
-    </w:p>
-    <w:p>
-      <w:pPr>
-        <w:pStyle w:val="Image"/>
-      </w:pPr>
-    </w:p>
-    <w:p>
-      <w:pPr>
-        <w:pStyle w:val="Heading2"/>
-      </w:pPr>
-      <w:r>
-        <w:t>Test gửi message thành công</w:t>
-      </w:r>
-    </w:p>
-    <w:p>
-      <w:pPr>
-        <w:pStyle w:val="Image"/>
-      </w:pPr>
-      <w:r>
-        <w:drawing>
-          <wp:inline distT="0" distB="0" distL="0" distR="0" wp14:anchorId="4BB1348E" wp14:editId="1222F2AA">
-            <wp:extent cx="5579745" cy="2964180"/>
-            <wp:effectExtent l="0" t="0" r="0" b="0"/>
-            <wp:docPr id="587450820" name="Picture 1"/>
-            <wp:cNvGraphicFramePr>
-              <a:graphicFrameLocks xmlns:a="http://schemas.openxmlformats.org/drawingml/2006/main" noChangeAspect="1"/>
-            </wp:cNvGraphicFramePr>
-            <a:graphic xmlns:a="http://schemas.openxmlformats.org/drawingml/2006/main">
-              <a:graphicData uri="http://schemas.openxmlformats.org/drawingml/2006/picture">
-                <pic:pic xmlns:pic="http://schemas.openxmlformats.org/drawingml/2006/picture">
-                  <pic:nvPicPr>
-                    <pic:cNvPr id="587450820" name=""/>
-                    <pic:cNvPicPr/>
-                  </pic:nvPicPr>
-                  <pic:blipFill>
-                    <a:blip r:embed="rId7"/>
-                    <a:stretch>
-                      <a:fillRect/>
-                    </a:stretch>
-                  </pic:blipFill>
-                  <pic:spPr>
-                    <a:xfrm>
-                      <a:off x="0" y="0"/>
-                      <a:ext cx="5579745" cy="2964180"/>
-                    </a:xfrm>
-                    <a:prstGeom prst="rect">
-                      <a:avLst/>
-                    </a:prstGeom>
-                  </pic:spPr>
-                </pic:pic>
-              </a:graphicData>
-            </a:graphic>
-          </wp:inline>
-        </w:drawing>
-      </w:r>
-    </w:p>
-    <w:p/>
-    <w:p>
-      <w:pPr>
-        <w:pStyle w:val="Image"/>
-      </w:pPr>
-      <w:r>
-        <w:lastRenderedPageBreak/>
-        <w:drawing>
-          <wp:inline distT="0" distB="0" distL="0" distR="0" wp14:anchorId="5A54888B" wp14:editId="1461CBD4">
-            <wp:extent cx="5579745" cy="2964180"/>
-            <wp:effectExtent l="0" t="0" r="0" b="0"/>
-            <wp:docPr id="144647756" name="Picture 1"/>
-            <wp:cNvGraphicFramePr>
-              <a:graphicFrameLocks xmlns:a="http://schemas.openxmlformats.org/drawingml/2006/main" noChangeAspect="1"/>
-            </wp:cNvGraphicFramePr>
-            <a:graphic xmlns:a="http://schemas.openxmlformats.org/drawingml/2006/main">
-              <a:graphicData uri="http://schemas.openxmlformats.org/drawingml/2006/picture">
-                <pic:pic xmlns:pic="http://schemas.openxmlformats.org/drawingml/2006/picture">
-                  <pic:nvPicPr>
-                    <pic:cNvPr id="144647756" name=""/>
                     <pic:cNvPicPr/>
                   </pic:nvPicPr>
                   <pic:blipFill>
@@ -729,32 +633,30 @@
     </w:p>
     <w:p>
       <w:pPr>
+        <w:pStyle w:val="Image"/>
+      </w:pPr>
+    </w:p>
+    <w:p>
+      <w:pPr>
         <w:pStyle w:val="Heading2"/>
       </w:pPr>
       <w:r>
-        <w:t xml:space="preserve">Test gửi message </w:t>
-      </w:r>
-      <w:r>
-        <w:t>thất bại</w:t>
+        <w:t>Test gửi message thành công</w:t>
       </w:r>
     </w:p>
     <w:p>
       <w:pPr>
         <w:pStyle w:val="Image"/>
-        <w:jc w:val="left"/>
-      </w:pPr>
-    </w:p>
-    <w:p>
-      <w:pPr>
-        <w:spacing w:before="0" w:after="160" w:line="259" w:lineRule="auto"/>
-        <w:ind w:firstLine="0"/>
-      </w:pPr>
-      <w:r>
+      </w:pPr>
+      <w:r>
+        <w:rPr>
+          <w:noProof/>
+        </w:rPr>
         <w:drawing>
-          <wp:inline distT="0" distB="0" distL="0" distR="0" wp14:anchorId="7FA73A38" wp14:editId="65BD0FD5">
+          <wp:inline distT="0" distB="0" distL="0" distR="0" wp14:anchorId="4BB1348E" wp14:editId="1222F2AA">
             <wp:extent cx="5579745" cy="2964180"/>
             <wp:effectExtent l="0" t="0" r="0" b="0"/>
-            <wp:docPr id="20546559" name="Picture 1"/>
+            <wp:docPr id="587450820" name="Picture 1"/>
             <wp:cNvGraphicFramePr>
               <a:graphicFrameLocks xmlns:a="http://schemas.openxmlformats.org/drawingml/2006/main" noChangeAspect="1"/>
             </wp:cNvGraphicFramePr>
@@ -762,7 +664,7 @@
               <a:graphicData uri="http://schemas.openxmlformats.org/drawingml/2006/picture">
                 <pic:pic xmlns:pic="http://schemas.openxmlformats.org/drawingml/2006/picture">
                   <pic:nvPicPr>
-                    <pic:cNvPr id="20546559" name=""/>
+                    <pic:cNvPr id="587450820" name=""/>
                     <pic:cNvPicPr/>
                   </pic:nvPicPr>
                   <pic:blipFill>
@@ -793,12 +695,15 @@
         <w:pStyle w:val="Image"/>
       </w:pPr>
       <w:r>
+        <w:rPr>
+          <w:noProof/>
+        </w:rPr>
         <w:lastRenderedPageBreak/>
         <w:drawing>
-          <wp:inline distT="0" distB="0" distL="0" distR="0" wp14:anchorId="08623E4E" wp14:editId="7395F31C">
+          <wp:inline distT="0" distB="0" distL="0" distR="0" wp14:anchorId="5A54888B" wp14:editId="1461CBD4">
             <wp:extent cx="5579745" cy="2964180"/>
             <wp:effectExtent l="0" t="0" r="0" b="0"/>
-            <wp:docPr id="643519284" name="Picture 1"/>
+            <wp:docPr id="144647756" name="Picture 1"/>
             <wp:cNvGraphicFramePr>
               <a:graphicFrameLocks xmlns:a="http://schemas.openxmlformats.org/drawingml/2006/main" noChangeAspect="1"/>
             </wp:cNvGraphicFramePr>
@@ -806,7 +711,7 @@
               <a:graphicData uri="http://schemas.openxmlformats.org/drawingml/2006/picture">
                 <pic:pic xmlns:pic="http://schemas.openxmlformats.org/drawingml/2006/picture">
                   <pic:nvPicPr>
-                    <pic:cNvPr id="643519284" name=""/>
+                    <pic:cNvPr id="144647756" name=""/>
                     <pic:cNvPicPr/>
                   </pic:nvPicPr>
                   <pic:blipFill>
@@ -833,15 +738,32 @@
     </w:p>
     <w:p>
       <w:pPr>
+        <w:pStyle w:val="Heading2"/>
+      </w:pPr>
+      <w:r>
+        <w:t>Test gửi message thất bại</w:t>
+      </w:r>
+    </w:p>
+    <w:p>
+      <w:pPr>
+        <w:pStyle w:val="Image"/>
+        <w:jc w:val="left"/>
+      </w:pPr>
+    </w:p>
+    <w:p>
+      <w:pPr>
         <w:spacing w:before="0" w:after="160" w:line="259" w:lineRule="auto"/>
         <w:ind w:firstLine="0"/>
       </w:pPr>
       <w:r>
+        <w:rPr>
+          <w:noProof/>
+        </w:rPr>
         <w:drawing>
-          <wp:inline distT="0" distB="0" distL="0" distR="0" wp14:anchorId="45FA2219" wp14:editId="51F94CD5">
-            <wp:extent cx="5579745" cy="2594610"/>
+          <wp:inline distT="0" distB="0" distL="0" distR="0" wp14:anchorId="7FA73A38" wp14:editId="65BD0FD5">
+            <wp:extent cx="5579745" cy="2964180"/>
             <wp:effectExtent l="0" t="0" r="0" b="0"/>
-            <wp:docPr id="803208660" name="Picture 1"/>
+            <wp:docPr id="20546559" name="Picture 1"/>
             <wp:cNvGraphicFramePr>
               <a:graphicFrameLocks xmlns:a="http://schemas.openxmlformats.org/drawingml/2006/main" noChangeAspect="1"/>
             </wp:cNvGraphicFramePr>
@@ -849,7 +771,7 @@
               <a:graphicData uri="http://schemas.openxmlformats.org/drawingml/2006/picture">
                 <pic:pic xmlns:pic="http://schemas.openxmlformats.org/drawingml/2006/picture">
                   <pic:nvPicPr>
-                    <pic:cNvPr id="803208660" name=""/>
+                    <pic:cNvPr id="20546559" name=""/>
                     <pic:cNvPicPr/>
                   </pic:nvPicPr>
                   <pic:blipFill>
@@ -861,7 +783,7 @@
                   <pic:spPr>
                     <a:xfrm>
                       <a:off x="0" y="0"/>
-                      <a:ext cx="5579745" cy="2594610"/>
+                      <a:ext cx="5579745" cy="2964180"/>
                     </a:xfrm>
                     <a:prstGeom prst="rect">
                       <a:avLst/>
@@ -873,130 +795,22 @@
           </wp:inline>
         </w:drawing>
       </w:r>
-      <w:r>
-        <w:br w:type="page"/>
-      </w:r>
-    </w:p>
-    <w:p>
-      <w:pPr>
-        <w:pStyle w:val="Heading2"/>
-      </w:pPr>
-      <w:r>
+    </w:p>
+    <w:p/>
+    <w:p>
+      <w:pPr>
+        <w:pStyle w:val="Image"/>
+      </w:pPr>
+      <w:r>
+        <w:rPr>
+          <w:noProof/>
+        </w:rPr>
         <w:lastRenderedPageBreak/>
-        <w:t xml:space="preserve">Làm thêm: </w:t>
-      </w:r>
-      <w:r>
-        <w:t>Hệ thống xử lý đơn hàng nâng cao với Priority Queue &amp; Retry Mechanism</w:t>
-      </w:r>
-    </w:p>
-    <w:p>
-      <w:pPr>
-        <w:pStyle w:val="Heading3"/>
-      </w:pPr>
-      <w:r>
-        <w:t>Tính năng mới:</w:t>
-      </w:r>
-    </w:p>
-    <w:p>
-      <w:pPr>
-        <w:numPr>
-          <w:ilvl w:val="0"/>
-          <w:numId w:val="21"/>
-        </w:numPr>
-      </w:pPr>
-      <w:r>
-        <w:rPr>
-          <w:b/>
-          <w:bCs/>
-        </w:rPr>
-        <w:t>Priority Queue</w:t>
-      </w:r>
-      <w:r>
-        <w:t> - Đơn hàng VIP được xử lý trước</w:t>
-      </w:r>
-    </w:p>
-    <w:p>
-      <w:pPr>
-        <w:numPr>
-          <w:ilvl w:val="0"/>
-          <w:numId w:val="21"/>
-        </w:numPr>
-      </w:pPr>
-      <w:r>
-        <w:rPr>
-          <w:b/>
-          <w:bCs/>
-        </w:rPr>
-        <w:t>Order Status Tracking</w:t>
-      </w:r>
-      <w:r>
-        <w:t> - Theo dõi trạng thái đơn hàng</w:t>
-      </w:r>
-    </w:p>
-    <w:p>
-      <w:pPr>
-        <w:numPr>
-          <w:ilvl w:val="0"/>
-          <w:numId w:val="21"/>
-        </w:numPr>
-      </w:pPr>
-      <w:r>
-        <w:rPr>
-          <w:b/>
-          <w:bCs/>
-        </w:rPr>
-        <w:t>Retry với Exponential Backoff</w:t>
-      </w:r>
-      <w:r>
-        <w:t> - Thử lại tự động khi lỗi</w:t>
-      </w:r>
-    </w:p>
-    <w:p>
-      <w:pPr>
-        <w:numPr>
-          <w:ilvl w:val="0"/>
-          <w:numId w:val="21"/>
-        </w:numPr>
-      </w:pPr>
-      <w:r>
-        <w:rPr>
-          <w:b/>
-          <w:bCs/>
-        </w:rPr>
-        <w:t>Multiple Queue Types</w:t>
-      </w:r>
-      <w:r>
-        <w:t> - Queue riêng cho từng loại đơn hàng</w:t>
-      </w:r>
-    </w:p>
-    <w:p/>
-    <w:p>
-      <w:pPr>
-        <w:pStyle w:val="Heading3"/>
-      </w:pPr>
-      <w:r>
-        <w:t>Test postman</w:t>
-      </w:r>
-    </w:p>
-    <w:p>
-      <w:pPr>
-        <w:pStyle w:val="Heading4"/>
-      </w:pPr>
-      <w:r>
-        <w:t>Gửi đơn hàng Priority THẤP</w:t>
-      </w:r>
-    </w:p>
-    <w:p>
-      <w:pPr>
-        <w:spacing w:before="0" w:after="160" w:line="259" w:lineRule="auto"/>
-        <w:ind w:firstLine="0"/>
-      </w:pPr>
-      <w:r>
         <w:drawing>
-          <wp:inline distT="0" distB="0" distL="0" distR="0" wp14:anchorId="767EDE2E" wp14:editId="3D292CF9">
+          <wp:inline distT="0" distB="0" distL="0" distR="0" wp14:anchorId="08623E4E" wp14:editId="7395F31C">
             <wp:extent cx="5579745" cy="2964180"/>
             <wp:effectExtent l="0" t="0" r="0" b="0"/>
-            <wp:docPr id="1609809858" name="Picture 1"/>
+            <wp:docPr id="643519284" name="Picture 1"/>
             <wp:cNvGraphicFramePr>
               <a:graphicFrameLocks xmlns:a="http://schemas.openxmlformats.org/drawingml/2006/main" noChangeAspect="1"/>
             </wp:cNvGraphicFramePr>
@@ -1004,7 +818,7 @@
               <a:graphicData uri="http://schemas.openxmlformats.org/drawingml/2006/picture">
                 <pic:pic xmlns:pic="http://schemas.openxmlformats.org/drawingml/2006/picture">
                   <pic:nvPicPr>
-                    <pic:cNvPr id="1609809858" name=""/>
+                    <pic:cNvPr id="643519284" name=""/>
                     <pic:cNvPicPr/>
                   </pic:nvPicPr>
                   <pic:blipFill>
@@ -1035,21 +849,14 @@
         <w:ind w:firstLine="0"/>
       </w:pPr>
       <w:r>
-        <w:t>1</w:t>
-      </w:r>
-    </w:p>
-    <w:p>
-      <w:pPr>
-        <w:spacing w:before="0" w:after="160" w:line="259" w:lineRule="auto"/>
-        <w:ind w:firstLine="0"/>
-      </w:pPr>
-      <w:r>
-        <w:lastRenderedPageBreak/>
+        <w:rPr>
+          <w:noProof/>
+        </w:rPr>
         <w:drawing>
-          <wp:inline distT="0" distB="0" distL="0" distR="0" wp14:anchorId="253A177A" wp14:editId="1F8A1E74">
-            <wp:extent cx="5579745" cy="2964180"/>
+          <wp:inline distT="0" distB="0" distL="0" distR="0" wp14:anchorId="45FA2219" wp14:editId="51F94CD5">
+            <wp:extent cx="5579745" cy="2594610"/>
             <wp:effectExtent l="0" t="0" r="0" b="0"/>
-            <wp:docPr id="2132568813" name="Picture 1"/>
+            <wp:docPr id="803208660" name="Picture 1"/>
             <wp:cNvGraphicFramePr>
               <a:graphicFrameLocks xmlns:a="http://schemas.openxmlformats.org/drawingml/2006/main" noChangeAspect="1"/>
             </wp:cNvGraphicFramePr>
@@ -1057,7 +864,7 @@
               <a:graphicData uri="http://schemas.openxmlformats.org/drawingml/2006/picture">
                 <pic:pic xmlns:pic="http://schemas.openxmlformats.org/drawingml/2006/picture">
                   <pic:nvPicPr>
-                    <pic:cNvPr id="2132568813" name=""/>
+                    <pic:cNvPr id="803208660" name=""/>
                     <pic:cNvPicPr/>
                   </pic:nvPicPr>
                   <pic:blipFill>
@@ -1069,7 +876,7 @@
                   <pic:spPr>
                     <a:xfrm>
                       <a:off x="0" y="0"/>
-                      <a:ext cx="5579745" cy="2964180"/>
+                      <a:ext cx="5579745" cy="2594610"/>
                     </a:xfrm>
                     <a:prstGeom prst="rect">
                       <a:avLst/>
@@ -1081,6 +888,118 @@
           </wp:inline>
         </w:drawing>
       </w:r>
+      <w:r>
+        <w:br w:type="page"/>
+      </w:r>
+    </w:p>
+    <w:p>
+      <w:pPr>
+        <w:pStyle w:val="Heading2"/>
+      </w:pPr>
+      <w:r>
+        <w:lastRenderedPageBreak/>
+        <w:t xml:space="preserve">Làm thêm: </w:t>
+      </w:r>
+      <w:r>
+        <w:t>Hệ thống xử lý đơn hàng nâng cao với Priority Queue &amp; Retry Mechanism</w:t>
+      </w:r>
+    </w:p>
+    <w:p>
+      <w:pPr>
+        <w:pStyle w:val="Heading3"/>
+      </w:pPr>
+      <w:r>
+        <w:t>Tính năng mới:</w:t>
+      </w:r>
+    </w:p>
+    <w:p>
+      <w:pPr>
+        <w:numPr>
+          <w:ilvl w:val="0"/>
+          <w:numId w:val="21"/>
+        </w:numPr>
+      </w:pPr>
+      <w:r>
+        <w:rPr>
+          <w:b/>
+          <w:bCs/>
+        </w:rPr>
+        <w:t>Priority Queue</w:t>
+      </w:r>
+      <w:r>
+        <w:t> - Đơn hàng VIP được xử lý trước</w:t>
+      </w:r>
+    </w:p>
+    <w:p>
+      <w:pPr>
+        <w:numPr>
+          <w:ilvl w:val="0"/>
+          <w:numId w:val="21"/>
+        </w:numPr>
+      </w:pPr>
+      <w:r>
+        <w:rPr>
+          <w:b/>
+          <w:bCs/>
+        </w:rPr>
+        <w:t>Order Status Tracking</w:t>
+      </w:r>
+      <w:r>
+        <w:t> - Theo dõi trạng thái đơn hàng</w:t>
+      </w:r>
+    </w:p>
+    <w:p>
+      <w:pPr>
+        <w:numPr>
+          <w:ilvl w:val="0"/>
+          <w:numId w:val="21"/>
+        </w:numPr>
+      </w:pPr>
+      <w:r>
+        <w:rPr>
+          <w:b/>
+          <w:bCs/>
+        </w:rPr>
+        <w:t>Retry với Exponential Backoff</w:t>
+      </w:r>
+      <w:r>
+        <w:t> - Thử lại tự động khi lỗi</w:t>
+      </w:r>
+    </w:p>
+    <w:p>
+      <w:pPr>
+        <w:numPr>
+          <w:ilvl w:val="0"/>
+          <w:numId w:val="21"/>
+        </w:numPr>
+      </w:pPr>
+      <w:r>
+        <w:rPr>
+          <w:b/>
+          <w:bCs/>
+        </w:rPr>
+        <w:t>Multiple Queue Types</w:t>
+      </w:r>
+      <w:r>
+        <w:t> - Queue riêng cho từng loại đơn hàng</w:t>
+      </w:r>
+    </w:p>
+    <w:p/>
+    <w:p>
+      <w:pPr>
+        <w:pStyle w:val="Heading3"/>
+      </w:pPr>
+      <w:r>
+        <w:t>Test postman</w:t>
+      </w:r>
+    </w:p>
+    <w:p>
+      <w:pPr>
+        <w:pStyle w:val="Heading4"/>
+      </w:pPr>
+      <w:r>
+        <w:t>Gửi đơn hàng Priority THẤP</w:t>
+      </w:r>
     </w:p>
     <w:p>
       <w:pPr>
@@ -1088,11 +1007,14 @@
         <w:ind w:firstLine="0"/>
       </w:pPr>
       <w:r>
+        <w:rPr>
+          <w:noProof/>
+        </w:rPr>
         <w:drawing>
-          <wp:inline distT="0" distB="0" distL="0" distR="0" wp14:anchorId="4B7A813A" wp14:editId="26582611">
+          <wp:inline distT="0" distB="0" distL="0" distR="0" wp14:anchorId="767EDE2E" wp14:editId="3D292CF9">
             <wp:extent cx="5579745" cy="2964180"/>
             <wp:effectExtent l="0" t="0" r="0" b="0"/>
-            <wp:docPr id="61363272" name="Picture 1"/>
+            <wp:docPr id="1609809858" name="Picture 1"/>
             <wp:cNvGraphicFramePr>
               <a:graphicFrameLocks xmlns:a="http://schemas.openxmlformats.org/drawingml/2006/main" noChangeAspect="1"/>
             </wp:cNvGraphicFramePr>
@@ -1100,7 +1022,7 @@
               <a:graphicData uri="http://schemas.openxmlformats.org/drawingml/2006/picture">
                 <pic:pic xmlns:pic="http://schemas.openxmlformats.org/drawingml/2006/picture">
                   <pic:nvPicPr>
-                    <pic:cNvPr id="61363272" name=""/>
+                    <pic:cNvPr id="1609809858" name=""/>
                     <pic:cNvPicPr/>
                   </pic:nvPicPr>
                   <pic:blipFill>
@@ -1130,6 +1052,9 @@
         <w:spacing w:before="0" w:after="160" w:line="259" w:lineRule="auto"/>
         <w:ind w:firstLine="0"/>
       </w:pPr>
+      <w:r>
+        <w:t>1</w:t>
+      </w:r>
     </w:p>
     <w:p>
       <w:pPr>
@@ -1137,12 +1062,15 @@
         <w:ind w:firstLine="0"/>
       </w:pPr>
       <w:r>
+        <w:rPr>
+          <w:noProof/>
+        </w:rPr>
         <w:lastRenderedPageBreak/>
         <w:drawing>
-          <wp:inline distT="0" distB="0" distL="0" distR="0" wp14:anchorId="14A71EFC" wp14:editId="29E35F68">
+          <wp:inline distT="0" distB="0" distL="0" distR="0" wp14:anchorId="253A177A" wp14:editId="1F8A1E74">
             <wp:extent cx="5579745" cy="2964180"/>
             <wp:effectExtent l="0" t="0" r="0" b="0"/>
-            <wp:docPr id="906604773" name="Picture 1"/>
+            <wp:docPr id="2132568813" name="Picture 1"/>
             <wp:cNvGraphicFramePr>
               <a:graphicFrameLocks xmlns:a="http://schemas.openxmlformats.org/drawingml/2006/main" noChangeAspect="1"/>
             </wp:cNvGraphicFramePr>
@@ -1150,7 +1078,7 @@
               <a:graphicData uri="http://schemas.openxmlformats.org/drawingml/2006/picture">
                 <pic:pic xmlns:pic="http://schemas.openxmlformats.org/drawingml/2006/picture">
                   <pic:nvPicPr>
-                    <pic:cNvPr id="906604773" name=""/>
+                    <pic:cNvPr id="2132568813" name=""/>
                     <pic:cNvPicPr/>
                   </pic:nvPicPr>
                   <pic:blipFill>
@@ -1177,77 +1105,18 @@
     </w:p>
     <w:p>
       <w:pPr>
-        <w:numPr>
-          <w:ilvl w:val="0"/>
-          <w:numId w:val="24"/>
-        </w:numPr>
-        <w:spacing w:before="0" w:after="160" w:line="259" w:lineRule="auto"/>
-      </w:pPr>
-      <w:r>
-        <w:t>VIP-PRIORITY-001 (xử lý trước - VIP queue)</w:t>
-      </w:r>
-    </w:p>
-    <w:p>
-      <w:pPr>
-        <w:numPr>
-          <w:ilvl w:val="0"/>
-          <w:numId w:val="24"/>
-        </w:numPr>
-        <w:spacing w:before="0" w:after="160" w:line="259" w:lineRule="auto"/>
-      </w:pPr>
-      <w:r>
-        <w:t>HIGH-001 (xử lý sau - priority 5)</w:t>
-      </w:r>
-    </w:p>
-    <w:p>
-      <w:pPr>
-        <w:numPr>
-          <w:ilvl w:val="0"/>
-          <w:numId w:val="24"/>
-        </w:numPr>
-        <w:spacing w:before="0" w:after="160" w:line="259" w:lineRule="auto"/>
-      </w:pPr>
-      <w:r>
-        <w:t>LOW-001 (xử lý cuối - priority 1)</w:t>
-      </w:r>
-    </w:p>
-    <w:p>
-      <w:pPr>
         <w:spacing w:before="0" w:after="160" w:line="259" w:lineRule="auto"/>
         <w:ind w:firstLine="0"/>
       </w:pPr>
       <w:r>
-        <w:br w:type="page"/>
-      </w:r>
-    </w:p>
-    <w:p>
-      <w:pPr>
-        <w:spacing w:before="0" w:after="160" w:line="259" w:lineRule="auto"/>
-        <w:ind w:firstLine="0"/>
-      </w:pPr>
-    </w:p>
-    <w:p/>
-    <w:p>
-      <w:pPr>
-        <w:pStyle w:val="Heading4"/>
-        <w:rPr>
-          <w:b/>
-        </w:rPr>
-      </w:pPr>
-      <w:r>
-        <w:t>Thêm order vip</w:t>
-      </w:r>
-    </w:p>
-    <w:p>
-      <w:pPr>
-        <w:ind w:firstLine="0"/>
-      </w:pPr>
-      <w:r>
+        <w:rPr>
+          <w:noProof/>
+        </w:rPr>
         <w:drawing>
-          <wp:inline distT="0" distB="0" distL="0" distR="0" wp14:anchorId="623BA947" wp14:editId="59CFD43B">
+          <wp:inline distT="0" distB="0" distL="0" distR="0" wp14:anchorId="4B7A813A" wp14:editId="26582611">
             <wp:extent cx="5579745" cy="2964180"/>
             <wp:effectExtent l="0" t="0" r="0" b="0"/>
-            <wp:docPr id="447140839" name="Picture 1"/>
+            <wp:docPr id="61363272" name="Picture 1"/>
             <wp:cNvGraphicFramePr>
               <a:graphicFrameLocks xmlns:a="http://schemas.openxmlformats.org/drawingml/2006/main" noChangeAspect="1"/>
             </wp:cNvGraphicFramePr>
@@ -1255,7 +1124,7 @@
               <a:graphicData uri="http://schemas.openxmlformats.org/drawingml/2006/picture">
                 <pic:pic xmlns:pic="http://schemas.openxmlformats.org/drawingml/2006/picture">
                   <pic:nvPicPr>
-                    <pic:cNvPr id="447140839" name=""/>
+                    <pic:cNvPr id="61363272" name=""/>
                     <pic:cNvPicPr/>
                   </pic:nvPicPr>
                   <pic:blipFill>
@@ -1282,14 +1151,25 @@
     </w:p>
     <w:p>
       <w:pPr>
+        <w:spacing w:before="0" w:after="160" w:line="259" w:lineRule="auto"/>
         <w:ind w:firstLine="0"/>
       </w:pPr>
-      <w:r>
+    </w:p>
+    <w:p>
+      <w:pPr>
+        <w:spacing w:before="0" w:after="160" w:line="259" w:lineRule="auto"/>
+        <w:ind w:firstLine="0"/>
+      </w:pPr>
+      <w:r>
+        <w:rPr>
+          <w:noProof/>
+        </w:rPr>
+        <w:lastRenderedPageBreak/>
         <w:drawing>
-          <wp:inline distT="0" distB="0" distL="0" distR="0" wp14:anchorId="62846BD6" wp14:editId="767D7E62">
+          <wp:inline distT="0" distB="0" distL="0" distR="0" wp14:anchorId="14A71EFC" wp14:editId="29E35F68">
             <wp:extent cx="5579745" cy="2964180"/>
             <wp:effectExtent l="0" t="0" r="0" b="0"/>
-            <wp:docPr id="394514400" name="Picture 1"/>
+            <wp:docPr id="906604773" name="Picture 1"/>
             <wp:cNvGraphicFramePr>
               <a:graphicFrameLocks xmlns:a="http://schemas.openxmlformats.org/drawingml/2006/main" noChangeAspect="1"/>
             </wp:cNvGraphicFramePr>
@@ -1297,7 +1177,7 @@
               <a:graphicData uri="http://schemas.openxmlformats.org/drawingml/2006/picture">
                 <pic:pic xmlns:pic="http://schemas.openxmlformats.org/drawingml/2006/picture">
                   <pic:nvPicPr>
-                    <pic:cNvPr id="394514400" name=""/>
+                    <pic:cNvPr id="906604773" name=""/>
                     <pic:cNvPicPr/>
                   </pic:nvPicPr>
                   <pic:blipFill>
@@ -1324,15 +1204,80 @@
     </w:p>
     <w:p>
       <w:pPr>
+        <w:numPr>
+          <w:ilvl w:val="0"/>
+          <w:numId w:val="24"/>
+        </w:numPr>
+        <w:spacing w:before="0" w:after="160" w:line="259" w:lineRule="auto"/>
+      </w:pPr>
+      <w:r>
+        <w:t>VIP-PRIORITY-001 (xử lý trước - VIP queue)</w:t>
+      </w:r>
+    </w:p>
+    <w:p>
+      <w:pPr>
+        <w:numPr>
+          <w:ilvl w:val="0"/>
+          <w:numId w:val="24"/>
+        </w:numPr>
+        <w:spacing w:before="0" w:after="160" w:line="259" w:lineRule="auto"/>
+      </w:pPr>
+      <w:r>
+        <w:t>HIGH-001 (xử lý sau - priority 5)</w:t>
+      </w:r>
+    </w:p>
+    <w:p>
+      <w:pPr>
+        <w:numPr>
+          <w:ilvl w:val="0"/>
+          <w:numId w:val="24"/>
+        </w:numPr>
+        <w:spacing w:before="0" w:after="160" w:line="259" w:lineRule="auto"/>
+      </w:pPr>
+      <w:r>
+        <w:t>LOW-001 (xử lý cuối - priority 1)</w:t>
+      </w:r>
+    </w:p>
+    <w:p>
+      <w:pPr>
+        <w:spacing w:before="0" w:after="160" w:line="259" w:lineRule="auto"/>
         <w:ind w:firstLine="0"/>
       </w:pPr>
       <w:r>
-        <w:lastRenderedPageBreak/>
+        <w:br w:type="page"/>
+      </w:r>
+    </w:p>
+    <w:p>
+      <w:pPr>
+        <w:spacing w:before="0" w:after="160" w:line="259" w:lineRule="auto"/>
+        <w:ind w:firstLine="0"/>
+      </w:pPr>
+    </w:p>
+    <w:p/>
+    <w:p>
+      <w:pPr>
+        <w:pStyle w:val="Heading4"/>
+        <w:rPr>
+          <w:b/>
+        </w:rPr>
+      </w:pPr>
+      <w:r>
+        <w:t>Thêm order vip</w:t>
+      </w:r>
+    </w:p>
+    <w:p>
+      <w:pPr>
+        <w:ind w:firstLine="0"/>
+      </w:pPr>
+      <w:r>
+        <w:rPr>
+          <w:noProof/>
+        </w:rPr>
         <w:drawing>
-          <wp:inline distT="0" distB="0" distL="0" distR="0" wp14:anchorId="2868F1E4" wp14:editId="44A0741A">
+          <wp:inline distT="0" distB="0" distL="0" distR="0" wp14:anchorId="623BA947" wp14:editId="59CFD43B">
             <wp:extent cx="5579745" cy="2964180"/>
             <wp:effectExtent l="0" t="0" r="0" b="0"/>
-            <wp:docPr id="108722839" name="Picture 1"/>
+            <wp:docPr id="447140839" name="Picture 1"/>
             <wp:cNvGraphicFramePr>
               <a:graphicFrameLocks xmlns:a="http://schemas.openxmlformats.org/drawingml/2006/main" noChangeAspect="1"/>
             </wp:cNvGraphicFramePr>
@@ -1340,7 +1285,7 @@
               <a:graphicData uri="http://schemas.openxmlformats.org/drawingml/2006/picture">
                 <pic:pic xmlns:pic="http://schemas.openxmlformats.org/drawingml/2006/picture">
                   <pic:nvPicPr>
-                    <pic:cNvPr id="108722839" name=""/>
+                    <pic:cNvPr id="447140839" name=""/>
                     <pic:cNvPicPr/>
                   </pic:nvPicPr>
                   <pic:blipFill>
@@ -1370,11 +1315,14 @@
         <w:ind w:firstLine="0"/>
       </w:pPr>
       <w:r>
+        <w:rPr>
+          <w:noProof/>
+        </w:rPr>
         <w:drawing>
-          <wp:inline distT="0" distB="0" distL="0" distR="0" wp14:anchorId="43CB7BE6" wp14:editId="09894D30">
+          <wp:inline distT="0" distB="0" distL="0" distR="0" wp14:anchorId="62846BD6" wp14:editId="767D7E62">
             <wp:extent cx="5579745" cy="2964180"/>
             <wp:effectExtent l="0" t="0" r="0" b="0"/>
-            <wp:docPr id="1441108206" name="Picture 1"/>
+            <wp:docPr id="394514400" name="Picture 1"/>
             <wp:cNvGraphicFramePr>
               <a:graphicFrameLocks xmlns:a="http://schemas.openxmlformats.org/drawingml/2006/main" noChangeAspect="1"/>
             </wp:cNvGraphicFramePr>
@@ -1382,7 +1330,7 @@
               <a:graphicData uri="http://schemas.openxmlformats.org/drawingml/2006/picture">
                 <pic:pic xmlns:pic="http://schemas.openxmlformats.org/drawingml/2006/picture">
                   <pic:nvPicPr>
-                    <pic:cNvPr id="1441108206" name=""/>
+                    <pic:cNvPr id="394514400" name=""/>
                     <pic:cNvPicPr/>
                   </pic:nvPicPr>
                   <pic:blipFill>
@@ -1407,7 +1355,476 @@
         </w:drawing>
       </w:r>
     </w:p>
+    <w:p>
+      <w:pPr>
+        <w:ind w:firstLine="0"/>
+      </w:pPr>
+      <w:r>
+        <w:rPr>
+          <w:noProof/>
+        </w:rPr>
+        <w:lastRenderedPageBreak/>
+        <w:drawing>
+          <wp:inline distT="0" distB="0" distL="0" distR="0" wp14:anchorId="2868F1E4" wp14:editId="44A0741A">
+            <wp:extent cx="5579745" cy="2964180"/>
+            <wp:effectExtent l="0" t="0" r="0" b="0"/>
+            <wp:docPr id="108722839" name="Picture 1"/>
+            <wp:cNvGraphicFramePr>
+              <a:graphicFrameLocks xmlns:a="http://schemas.openxmlformats.org/drawingml/2006/main" noChangeAspect="1"/>
+            </wp:cNvGraphicFramePr>
+            <a:graphic xmlns:a="http://schemas.openxmlformats.org/drawingml/2006/main">
+              <a:graphicData uri="http://schemas.openxmlformats.org/drawingml/2006/picture">
+                <pic:pic xmlns:pic="http://schemas.openxmlformats.org/drawingml/2006/picture">
+                  <pic:nvPicPr>
+                    <pic:cNvPr id="108722839" name=""/>
+                    <pic:cNvPicPr/>
+                  </pic:nvPicPr>
+                  <pic:blipFill>
+                    <a:blip r:embed="rId20"/>
+                    <a:stretch>
+                      <a:fillRect/>
+                    </a:stretch>
+                  </pic:blipFill>
+                  <pic:spPr>
+                    <a:xfrm>
+                      <a:off x="0" y="0"/>
+                      <a:ext cx="5579745" cy="2964180"/>
+                    </a:xfrm>
+                    <a:prstGeom prst="rect">
+                      <a:avLst/>
+                    </a:prstGeom>
+                  </pic:spPr>
+                </pic:pic>
+              </a:graphicData>
+            </a:graphic>
+          </wp:inline>
+        </w:drawing>
+      </w:r>
+    </w:p>
+    <w:p>
+      <w:pPr>
+        <w:ind w:firstLine="0"/>
+      </w:pPr>
+      <w:r>
+        <w:rPr>
+          <w:noProof/>
+        </w:rPr>
+        <w:drawing>
+          <wp:inline distT="0" distB="0" distL="0" distR="0" wp14:anchorId="43CB7BE6" wp14:editId="09894D30">
+            <wp:extent cx="5579745" cy="2964180"/>
+            <wp:effectExtent l="0" t="0" r="0" b="0"/>
+            <wp:docPr id="1441108206" name="Picture 1"/>
+            <wp:cNvGraphicFramePr>
+              <a:graphicFrameLocks xmlns:a="http://schemas.openxmlformats.org/drawingml/2006/main" noChangeAspect="1"/>
+            </wp:cNvGraphicFramePr>
+            <a:graphic xmlns:a="http://schemas.openxmlformats.org/drawingml/2006/main">
+              <a:graphicData uri="http://schemas.openxmlformats.org/drawingml/2006/picture">
+                <pic:pic xmlns:pic="http://schemas.openxmlformats.org/drawingml/2006/picture">
+                  <pic:nvPicPr>
+                    <pic:cNvPr id="1441108206" name=""/>
+                    <pic:cNvPicPr/>
+                  </pic:nvPicPr>
+                  <pic:blipFill>
+                    <a:blip r:embed="rId21"/>
+                    <a:stretch>
+                      <a:fillRect/>
+                    </a:stretch>
+                  </pic:blipFill>
+                  <pic:spPr>
+                    <a:xfrm>
+                      <a:off x="0" y="0"/>
+                      <a:ext cx="5579745" cy="2964180"/>
+                    </a:xfrm>
+                    <a:prstGeom prst="rect">
+                      <a:avLst/>
+                    </a:prstGeom>
+                  </pic:spPr>
+                </pic:pic>
+              </a:graphicData>
+            </a:graphic>
+          </wp:inline>
+        </w:drawing>
+      </w:r>
+    </w:p>
+    <w:p>
+      <w:pPr>
+        <w:spacing w:before="0" w:after="160" w:line="259" w:lineRule="auto"/>
+        <w:ind w:firstLine="0"/>
+      </w:pPr>
+      <w:r>
+        <w:br w:type="page"/>
+      </w:r>
+    </w:p>
+    <w:p>
+      <w:pPr>
+        <w:pStyle w:val="Heading1"/>
+        <w:spacing w:after="120"/>
+      </w:pPr>
+      <w:r>
+        <w:lastRenderedPageBreak/>
+        <w:t>JWT</w:t>
+      </w:r>
+    </w:p>
+    <w:p>
+      <w:pPr>
+        <w:pStyle w:val="Heading2"/>
+        <w:rPr>
+          <w:lang w:eastAsia="zh-CN"/>
+        </w:rPr>
+      </w:pPr>
+      <w:r>
+        <w:rPr>
+          <w:lang w:eastAsia="zh-CN"/>
+        </w:rPr>
+        <w:t>Code spring boot</w:t>
+      </w:r>
+    </w:p>
+    <w:p>
+      <w:pPr>
+        <w:pStyle w:val="Image"/>
+        <w:rPr>
+          <w:lang w:eastAsia="zh-CN"/>
+        </w:rPr>
+      </w:pPr>
+      <w:r>
+        <w:rPr>
+          <w:lang w:eastAsia="zh-CN"/>
+        </w:rPr>
+        <w:drawing>
+          <wp:inline distT="0" distB="0" distL="0" distR="0" wp14:anchorId="580477E1" wp14:editId="7A7020D4">
+            <wp:extent cx="5579745" cy="3034030"/>
+            <wp:effectExtent l="0" t="0" r="1905" b="0"/>
+            <wp:docPr id="1697841700" name="Picture 1"/>
+            <wp:cNvGraphicFramePr>
+              <a:graphicFrameLocks xmlns:a="http://schemas.openxmlformats.org/drawingml/2006/main" noChangeAspect="1"/>
+            </wp:cNvGraphicFramePr>
+            <a:graphic xmlns:a="http://schemas.openxmlformats.org/drawingml/2006/main">
+              <a:graphicData uri="http://schemas.openxmlformats.org/drawingml/2006/picture">
+                <pic:pic xmlns:pic="http://schemas.openxmlformats.org/drawingml/2006/picture">
+                  <pic:nvPicPr>
+                    <pic:cNvPr id="1697841700" name=""/>
+                    <pic:cNvPicPr/>
+                  </pic:nvPicPr>
+                  <pic:blipFill>
+                    <a:blip r:embed="rId22"/>
+                    <a:stretch>
+                      <a:fillRect/>
+                    </a:stretch>
+                  </pic:blipFill>
+                  <pic:spPr>
+                    <a:xfrm>
+                      <a:off x="0" y="0"/>
+                      <a:ext cx="5579745" cy="3034030"/>
+                    </a:xfrm>
+                    <a:prstGeom prst="rect">
+                      <a:avLst/>
+                    </a:prstGeom>
+                  </pic:spPr>
+                </pic:pic>
+              </a:graphicData>
+            </a:graphic>
+          </wp:inline>
+        </w:drawing>
+      </w:r>
+    </w:p>
+    <w:p>
+      <w:pPr>
+        <w:pStyle w:val="Heading2"/>
+        <w:rPr>
+          <w:lang w:eastAsia="zh-CN"/>
+        </w:rPr>
+      </w:pPr>
+      <w:r>
+        <w:rPr>
+          <w:lang w:eastAsia="zh-CN"/>
+        </w:rPr>
+        <w:t>Test truy cập public</w:t>
+      </w:r>
+    </w:p>
+    <w:p>
+      <w:pPr>
+        <w:pStyle w:val="Image"/>
+        <w:rPr>
+          <w:lang w:eastAsia="zh-CN"/>
+        </w:rPr>
+      </w:pPr>
+      <w:r>
+        <w:rPr>
+          <w:noProof/>
+        </w:rPr>
+        <w:drawing>
+          <wp:inline distT="0" distB="0" distL="0" distR="0" wp14:anchorId="07CF1642" wp14:editId="1D1393C4">
+            <wp:extent cx="5579745" cy="2964180"/>
+            <wp:effectExtent l="0" t="0" r="1905" b="7620"/>
+            <wp:docPr id="432245076" name="Picture 1"/>
+            <wp:cNvGraphicFramePr>
+              <a:graphicFrameLocks xmlns:a="http://schemas.openxmlformats.org/drawingml/2006/main" noChangeAspect="1"/>
+            </wp:cNvGraphicFramePr>
+            <a:graphic xmlns:a="http://schemas.openxmlformats.org/drawingml/2006/main">
+              <a:graphicData uri="http://schemas.openxmlformats.org/drawingml/2006/picture">
+                <pic:pic xmlns:pic="http://schemas.openxmlformats.org/drawingml/2006/picture">
+                  <pic:nvPicPr>
+                    <pic:cNvPr id="432245076" name=""/>
+                    <pic:cNvPicPr/>
+                  </pic:nvPicPr>
+                  <pic:blipFill>
+                    <a:blip r:embed="rId23"/>
+                    <a:stretch>
+                      <a:fillRect/>
+                    </a:stretch>
+                  </pic:blipFill>
+                  <pic:spPr>
+                    <a:xfrm>
+                      <a:off x="0" y="0"/>
+                      <a:ext cx="5579745" cy="2964180"/>
+                    </a:xfrm>
+                    <a:prstGeom prst="rect">
+                      <a:avLst/>
+                    </a:prstGeom>
+                  </pic:spPr>
+                </pic:pic>
+              </a:graphicData>
+            </a:graphic>
+          </wp:inline>
+        </w:drawing>
+      </w:r>
+    </w:p>
+    <w:p>
+      <w:pPr>
+        <w:pStyle w:val="Heading2"/>
+        <w:rPr>
+          <w:lang w:eastAsia="zh-CN"/>
+        </w:rPr>
+      </w:pPr>
+      <w:r>
+        <w:rPr>
+          <w:lang w:eastAsia="zh-CN"/>
+        </w:rPr>
+        <w:lastRenderedPageBreak/>
+        <w:t>Test truy cập private ( chưa có token )</w:t>
+      </w:r>
+    </w:p>
+    <w:p>
+      <w:pPr>
+        <w:pStyle w:val="Image"/>
+        <w:rPr>
+          <w:lang w:eastAsia="zh-CN"/>
+        </w:rPr>
+      </w:pPr>
+      <w:r>
+        <w:rPr>
+          <w:lang w:eastAsia="zh-CN"/>
+        </w:rPr>
+        <w:drawing>
+          <wp:inline distT="0" distB="0" distL="0" distR="0" wp14:anchorId="6F3632DB" wp14:editId="50EF5094">
+            <wp:extent cx="5579745" cy="2964180"/>
+            <wp:effectExtent l="0" t="0" r="1905" b="7620"/>
+            <wp:docPr id="1009302520" name="Picture 1"/>
+            <wp:cNvGraphicFramePr>
+              <a:graphicFrameLocks xmlns:a="http://schemas.openxmlformats.org/drawingml/2006/main" noChangeAspect="1"/>
+            </wp:cNvGraphicFramePr>
+            <a:graphic xmlns:a="http://schemas.openxmlformats.org/drawingml/2006/main">
+              <a:graphicData uri="http://schemas.openxmlformats.org/drawingml/2006/picture">
+                <pic:pic xmlns:pic="http://schemas.openxmlformats.org/drawingml/2006/picture">
+                  <pic:nvPicPr>
+                    <pic:cNvPr id="1009302520" name=""/>
+                    <pic:cNvPicPr/>
+                  </pic:nvPicPr>
+                  <pic:blipFill>
+                    <a:blip r:embed="rId24"/>
+                    <a:stretch>
+                      <a:fillRect/>
+                    </a:stretch>
+                  </pic:blipFill>
+                  <pic:spPr>
+                    <a:xfrm>
+                      <a:off x="0" y="0"/>
+                      <a:ext cx="5579745" cy="2964180"/>
+                    </a:xfrm>
+                    <a:prstGeom prst="rect">
+                      <a:avLst/>
+                    </a:prstGeom>
+                  </pic:spPr>
+                </pic:pic>
+              </a:graphicData>
+            </a:graphic>
+          </wp:inline>
+        </w:drawing>
+      </w:r>
+    </w:p>
+    <w:p>
+      <w:pPr>
+        <w:pStyle w:val="Image"/>
+        <w:rPr>
+          <w:lang w:eastAsia="zh-CN"/>
+        </w:rPr>
+      </w:pPr>
+    </w:p>
+    <w:p>
+      <w:pPr>
+        <w:pStyle w:val="Image"/>
+        <w:rPr>
+          <w:lang w:eastAsia="zh-CN"/>
+        </w:rPr>
+      </w:pPr>
+    </w:p>
+    <w:p>
+      <w:pPr>
+        <w:pStyle w:val="Image"/>
+        <w:rPr>
+          <w:lang w:eastAsia="zh-CN"/>
+        </w:rPr>
+      </w:pPr>
+    </w:p>
+    <w:p>
+      <w:pPr>
+        <w:pStyle w:val="Image"/>
+        <w:rPr>
+          <w:lang w:eastAsia="zh-CN"/>
+        </w:rPr>
+      </w:pPr>
+    </w:p>
+    <w:p>
+      <w:pPr>
+        <w:pStyle w:val="Heading2"/>
+        <w:rPr>
+          <w:lang w:eastAsia="zh-CN"/>
+        </w:rPr>
+      </w:pPr>
+      <w:r>
+        <w:rPr>
+          <w:lang w:eastAsia="zh-CN"/>
+        </w:rPr>
+        <w:lastRenderedPageBreak/>
+        <w:t>Test truy cập private ( khi có token )</w:t>
+      </w:r>
+    </w:p>
+    <w:p>
+      <w:pPr>
+        <w:pStyle w:val="Heading3"/>
+        <w:rPr>
+          <w:lang w:eastAsia="zh-CN"/>
+        </w:rPr>
+      </w:pPr>
+      <w:r>
+        <w:rPr>
+          <w:lang w:eastAsia="zh-CN"/>
+        </w:rPr>
+        <w:t>Tạo token trên jwt.io</w:t>
+      </w:r>
+    </w:p>
+    <w:p>
+      <w:pPr>
+        <w:rPr>
+          <w:lang w:eastAsia="zh-CN"/>
+        </w:rPr>
+      </w:pPr>
+      <w:r>
+        <w:rPr>
+          <w:lang w:eastAsia="zh-CN"/>
+        </w:rPr>
+        <w:drawing>
+          <wp:inline distT="0" distB="0" distL="0" distR="0" wp14:anchorId="4814E0A1" wp14:editId="4FE23B7B">
+            <wp:extent cx="5579745" cy="5642610"/>
+            <wp:effectExtent l="0" t="0" r="1905" b="0"/>
+            <wp:docPr id="1650612137" name="Picture 1"/>
+            <wp:cNvGraphicFramePr>
+              <a:graphicFrameLocks xmlns:a="http://schemas.openxmlformats.org/drawingml/2006/main" noChangeAspect="1"/>
+            </wp:cNvGraphicFramePr>
+            <a:graphic xmlns:a="http://schemas.openxmlformats.org/drawingml/2006/main">
+              <a:graphicData uri="http://schemas.openxmlformats.org/drawingml/2006/picture">
+                <pic:pic xmlns:pic="http://schemas.openxmlformats.org/drawingml/2006/picture">
+                  <pic:nvPicPr>
+                    <pic:cNvPr id="1650612137" name=""/>
+                    <pic:cNvPicPr/>
+                  </pic:nvPicPr>
+                  <pic:blipFill>
+                    <a:blip r:embed="rId25"/>
+                    <a:stretch>
+                      <a:fillRect/>
+                    </a:stretch>
+                  </pic:blipFill>
+                  <pic:spPr>
+                    <a:xfrm>
+                      <a:off x="0" y="0"/>
+                      <a:ext cx="5579745" cy="5642610"/>
+                    </a:xfrm>
+                    <a:prstGeom prst="rect">
+                      <a:avLst/>
+                    </a:prstGeom>
+                  </pic:spPr>
+                </pic:pic>
+              </a:graphicData>
+            </a:graphic>
+          </wp:inline>
+        </w:drawing>
+      </w:r>
+    </w:p>
+    <w:p>
+      <w:pPr>
+        <w:pStyle w:val="Heading3"/>
+        <w:rPr>
+          <w:lang w:eastAsia="zh-CN"/>
+        </w:rPr>
+      </w:pPr>
+      <w:r>
+        <w:rPr>
+          <w:lang w:eastAsia="zh-CN"/>
+        </w:rPr>
+        <w:lastRenderedPageBreak/>
+        <w:t>Test postman</w:t>
+      </w:r>
+    </w:p>
+    <w:p>
+      <w:pPr>
+        <w:pStyle w:val="Image"/>
+        <w:rPr>
+          <w:lang w:eastAsia="zh-CN"/>
+        </w:rPr>
+      </w:pPr>
+      <w:r>
+        <w:rPr>
+          <w:lang w:eastAsia="zh-CN"/>
+        </w:rPr>
+        <w:drawing>
+          <wp:inline distT="0" distB="0" distL="0" distR="0" wp14:anchorId="22D7A021" wp14:editId="52C4DD10">
+            <wp:extent cx="5579745" cy="2964180"/>
+            <wp:effectExtent l="0" t="0" r="1905" b="7620"/>
+            <wp:docPr id="790432306" name="Picture 1"/>
+            <wp:cNvGraphicFramePr>
+              <a:graphicFrameLocks xmlns:a="http://schemas.openxmlformats.org/drawingml/2006/main" noChangeAspect="1"/>
+            </wp:cNvGraphicFramePr>
+            <a:graphic xmlns:a="http://schemas.openxmlformats.org/drawingml/2006/main">
+              <a:graphicData uri="http://schemas.openxmlformats.org/drawingml/2006/picture">
+                <pic:pic xmlns:pic="http://schemas.openxmlformats.org/drawingml/2006/picture">
+                  <pic:nvPicPr>
+                    <pic:cNvPr id="790432306" name=""/>
+                    <pic:cNvPicPr/>
+                  </pic:nvPicPr>
+                  <pic:blipFill>
+                    <a:blip r:embed="rId26"/>
+                    <a:stretch>
+                      <a:fillRect/>
+                    </a:stretch>
+                  </pic:blipFill>
+                  <pic:spPr>
+                    <a:xfrm>
+                      <a:off x="0" y="0"/>
+                      <a:ext cx="5579745" cy="2964180"/>
+                    </a:xfrm>
+                    <a:prstGeom prst="rect">
+                      <a:avLst/>
+                    </a:prstGeom>
+                  </pic:spPr>
+                </pic:pic>
+              </a:graphicData>
+            </a:graphic>
+          </wp:inline>
+        </w:drawing>
+      </w:r>
+    </w:p>
     <w:sectPr>
+      <w:footerReference w:type="default" r:id="rId27"/>
       <w:type w:val="continuous"/>
       <w:pgSz w:w="11906" w:h="16838"/>
       <w:pgMar w:top="1701" w:right="1134" w:bottom="1701" w:left="1985" w:header="6" w:footer="142" w:gutter="0"/>
@@ -1416,6 +1833,109 @@
     </w:sectPr>
   </w:body>
 </w:document>
+</file>
+
+<file path=word/endnotes.xml><?xml version="1.0" encoding="utf-8"?>
+<w:endnotes xmlns:wpc="http://schemas.microsoft.com/office/word/2010/wordprocessingCanvas" xmlns:cx="http://schemas.microsoft.com/office/drawing/2014/chartex" xmlns:cx1="http://schemas.microsoft.com/office/drawing/2015/9/8/chartex" xmlns:cx2="http://schemas.microsoft.com/office/drawing/2015/10/21/chartex" xmlns:cx3="http://schemas.microsoft.com/office/drawing/2016/5/9/chartex" xmlns:cx4="http://schemas.microsoft.com/office/drawing/2016/5/10/chartex" xmlns:cx5="http://schemas.microsoft.com/office/drawing/2016/5/11/chartex" xmlns:cx6="http://schemas.microsoft.com/office/drawing/2016/5/12/chartex" xmlns:cx7="http://schemas.microsoft.com/office/drawing/2016/5/13/chartex" xmlns:cx8="http://schemas.microsoft.com/office/drawing/2016/5/14/chartex" xmlns:mc="http://schemas.openxmlformats.org/markup-compatibility/2006" xmlns:aink="http://schemas.microsoft.com/office/drawing/2016/ink" xmlns:am3d="http://schemas.microsoft.com/office/drawing/2017/model3d" xmlns:o="urn:schemas-microsoft-com:office:office" xmlns:oel="http://schemas.microsoft.com/office/2019/extlst" xmlns:r="http://schemas.openxmlformats.org/officeDocument/2006/relationships" xmlns:m="http://schemas.openxmlformats.org/officeDocument/2006/math" xmlns:v="urn:schemas-microsoft-com:vml" xmlns:wp14="http://schemas.microsoft.com/office/word/2010/wordprocessingDrawing" xmlns:wp="http://schemas.openxmlformats.org/drawingml/2006/wordprocessingDrawing" xmlns:w10="urn:schemas-microsoft-com:office:word" xmlns:w="http://schemas.openxmlformats.org/wordprocessingml/2006/main" xmlns:w14="http://schemas.microsoft.com/office/word/2010/wordml" xmlns:w15="http://schemas.microsoft.com/office/word/2012/wordml" xmlns:w16cex="http://schemas.microsoft.com/office/word/2018/wordml/cex" xmlns:w16cid="http://schemas.microsoft.com/office/word/2016/wordml/cid" xmlns:w16="http://schemas.microsoft.com/office/word/2018/wordml" xmlns:w16du="http://schemas.microsoft.com/office/word/2023/wordml/word16du" xmlns:w16sdtdh="http://schemas.microsoft.com/office/word/2020/wordml/sdtdatahash" xmlns:w16sdtfl="http://schemas.microsoft.com/office/word/2024/wordml/sdtformatlock" xmlns:w16se="http://schemas.microsoft.com/office/word/2015/wordml/symex" xmlns:wpg="http://schemas.microsoft.com/office/word/2010/wordprocessingGroup" xmlns:wpi="http://schemas.microsoft.com/office/word/2010/wordprocessingInk" xmlns:wne="http://schemas.microsoft.com/office/word/2006/wordml" xmlns:wps="http://schemas.microsoft.com/office/word/2010/wordprocessingShape" mc:Ignorable="w14 w15 w16se w16cid w16 w16cex w16sdtdh w16sdtfl w16du wp14">
+  <w:endnote w:type="separator" w:id="-1">
+    <w:p>
+      <w:pPr>
+        <w:spacing w:before="0" w:line="240" w:lineRule="auto"/>
+      </w:pPr>
+      <w:r>
+        <w:separator/>
+      </w:r>
+    </w:p>
+  </w:endnote>
+  <w:endnote w:type="continuationSeparator" w:id="0">
+    <w:p>
+      <w:pPr>
+        <w:spacing w:before="0" w:line="240" w:lineRule="auto"/>
+      </w:pPr>
+      <w:r>
+        <w:continuationSeparator/>
+      </w:r>
+    </w:p>
+  </w:endnote>
+</w:endnotes>
+</file>
+
+<file path=word/footer1.xml><?xml version="1.0" encoding="utf-8"?>
+<w:ftr xmlns:wpc="http://schemas.microsoft.com/office/word/2010/wordprocessingCanvas" xmlns:cx="http://schemas.microsoft.com/office/drawing/2014/chartex" xmlns:cx1="http://schemas.microsoft.com/office/drawing/2015/9/8/chartex" xmlns:cx2="http://schemas.microsoft.com/office/drawing/2015/10/21/chartex" xmlns:cx3="http://schemas.microsoft.com/office/drawing/2016/5/9/chartex" xmlns:cx4="http://schemas.microsoft.com/office/drawing/2016/5/10/chartex" xmlns:cx5="http://schemas.microsoft.com/office/drawing/2016/5/11/chartex" xmlns:cx6="http://schemas.microsoft.com/office/drawing/2016/5/12/chartex" xmlns:cx7="http://schemas.microsoft.com/office/drawing/2016/5/13/chartex" xmlns:cx8="http://schemas.microsoft.com/office/drawing/2016/5/14/chartex" xmlns:mc="http://schemas.openxmlformats.org/markup-compatibility/2006" xmlns:aink="http://schemas.microsoft.com/office/drawing/2016/ink" xmlns:am3d="http://schemas.microsoft.com/office/drawing/2017/model3d" xmlns:o="urn:schemas-microsoft-com:office:office" xmlns:oel="http://schemas.microsoft.com/office/2019/extlst" xmlns:r="http://schemas.openxmlformats.org/officeDocument/2006/relationships" xmlns:m="http://schemas.openxmlformats.org/officeDocument/2006/math" xmlns:v="urn:schemas-microsoft-com:vml" xmlns:wp14="http://schemas.microsoft.com/office/word/2010/wordprocessingDrawing" xmlns:wp="http://schemas.openxmlformats.org/drawingml/2006/wordprocessingDrawing" xmlns:w10="urn:schemas-microsoft-com:office:word" xmlns:w="http://schemas.openxmlformats.org/wordprocessingml/2006/main" xmlns:w14="http://schemas.microsoft.com/office/word/2010/wordml" xmlns:w15="http://schemas.microsoft.com/office/word/2012/wordml" xmlns:w16cex="http://schemas.microsoft.com/office/word/2018/wordml/cex" xmlns:w16cid="http://schemas.microsoft.com/office/word/2016/wordml/cid" xmlns:w16="http://schemas.microsoft.com/office/word/2018/wordml" xmlns:w16du="http://schemas.microsoft.com/office/word/2023/wordml/word16du" xmlns:w16sdtdh="http://schemas.microsoft.com/office/word/2020/wordml/sdtdatahash" xmlns:w16sdtfl="http://schemas.microsoft.com/office/word/2024/wordml/sdtformatlock" xmlns:w16se="http://schemas.microsoft.com/office/word/2015/wordml/symex" xmlns:wpg="http://schemas.microsoft.com/office/word/2010/wordprocessingGroup" xmlns:wpi="http://schemas.microsoft.com/office/word/2010/wordprocessingInk" xmlns:wne="http://schemas.microsoft.com/office/word/2006/wordml" xmlns:wps="http://schemas.microsoft.com/office/word/2010/wordprocessingShape" mc:Ignorable="w14 w15 w16se w16cid w16 w16cex w16sdtdh w16sdtfl w16du wp14">
+  <w:sdt>
+    <w:sdtPr>
+      <w:id w:val="343979873"/>
+      <w:docPartObj>
+        <w:docPartGallery w:val="Page Numbers (Bottom of Page)"/>
+        <w:docPartUnique/>
+      </w:docPartObj>
+    </w:sdtPr>
+    <w:sdtEndPr>
+      <w:rPr>
+        <w:noProof/>
+      </w:rPr>
+    </w:sdtEndPr>
+    <w:sdtContent>
+      <w:p>
+        <w:pPr>
+          <w:pStyle w:val="Footer"/>
+          <w:jc w:val="right"/>
+        </w:pPr>
+        <w:r>
+          <w:fldChar w:fldCharType="begin"/>
+        </w:r>
+        <w:r>
+          <w:instrText xml:space="preserve"> PAGE   \* MERGEFORMAT </w:instrText>
+        </w:r>
+        <w:r>
+          <w:fldChar w:fldCharType="separate"/>
+        </w:r>
+        <w:r>
+          <w:rPr>
+            <w:noProof/>
+          </w:rPr>
+          <w:t>2</w:t>
+        </w:r>
+        <w:r>
+          <w:rPr>
+            <w:noProof/>
+          </w:rPr>
+          <w:fldChar w:fldCharType="end"/>
+        </w:r>
+      </w:p>
+    </w:sdtContent>
+  </w:sdt>
+  <w:p>
+    <w:pPr>
+      <w:pStyle w:val="Footer"/>
+    </w:pPr>
+  </w:p>
+</w:ftr>
+</file>
+
+<file path=word/footnotes.xml><?xml version="1.0" encoding="utf-8"?>
+<w:footnotes xmlns:wpc="http://schemas.microsoft.com/office/word/2010/wordprocessingCanvas" xmlns:cx="http://schemas.microsoft.com/office/drawing/2014/chartex" xmlns:cx1="http://schemas.microsoft.com/office/drawing/2015/9/8/chartex" xmlns:cx2="http://schemas.microsoft.com/office/drawing/2015/10/21/chartex" xmlns:cx3="http://schemas.microsoft.com/office/drawing/2016/5/9/chartex" xmlns:cx4="http://schemas.microsoft.com/office/drawing/2016/5/10/chartex" xmlns:cx5="http://schemas.microsoft.com/office/drawing/2016/5/11/chartex" xmlns:cx6="http://schemas.microsoft.com/office/drawing/2016/5/12/chartex" xmlns:cx7="http://schemas.microsoft.com/office/drawing/2016/5/13/chartex" xmlns:cx8="http://schemas.microsoft.com/office/drawing/2016/5/14/chartex" xmlns:mc="http://schemas.openxmlformats.org/markup-compatibility/2006" xmlns:aink="http://schemas.microsoft.com/office/drawing/2016/ink" xmlns:am3d="http://schemas.microsoft.com/office/drawing/2017/model3d" xmlns:o="urn:schemas-microsoft-com:office:office" xmlns:oel="http://schemas.microsoft.com/office/2019/extlst" xmlns:r="http://schemas.openxmlformats.org/officeDocument/2006/relationships" xmlns:m="http://schemas.openxmlformats.org/officeDocument/2006/math" xmlns:v="urn:schemas-microsoft-com:vml" xmlns:wp14="http://schemas.microsoft.com/office/word/2010/wordprocessingDrawing" xmlns:wp="http://schemas.openxmlformats.org/drawingml/2006/wordprocessingDrawing" xmlns:w10="urn:schemas-microsoft-com:office:word" xmlns:w="http://schemas.openxmlformats.org/wordprocessingml/2006/main" xmlns:w14="http://schemas.microsoft.com/office/word/2010/wordml" xmlns:w15="http://schemas.microsoft.com/office/word/2012/wordml" xmlns:w16cex="http://schemas.microsoft.com/office/word/2018/wordml/cex" xmlns:w16cid="http://schemas.microsoft.com/office/word/2016/wordml/cid" xmlns:w16="http://schemas.microsoft.com/office/word/2018/wordml" xmlns:w16du="http://schemas.microsoft.com/office/word/2023/wordml/word16du" xmlns:w16sdtdh="http://schemas.microsoft.com/office/word/2020/wordml/sdtdatahash" xmlns:w16sdtfl="http://schemas.microsoft.com/office/word/2024/wordml/sdtformatlock" xmlns:w16se="http://schemas.microsoft.com/office/word/2015/wordml/symex" xmlns:wpg="http://schemas.microsoft.com/office/word/2010/wordprocessingGroup" xmlns:wpi="http://schemas.microsoft.com/office/word/2010/wordprocessingInk" xmlns:wne="http://schemas.microsoft.com/office/word/2006/wordml" xmlns:wps="http://schemas.microsoft.com/office/word/2010/wordprocessingShape" mc:Ignorable="w14 w15 w16se w16cid w16 w16cex w16sdtdh w16sdtfl w16du wp14">
+  <w:footnote w:type="separator" w:id="-1">
+    <w:p>
+      <w:pPr>
+        <w:spacing w:before="0" w:line="240" w:lineRule="auto"/>
+      </w:pPr>
+      <w:r>
+        <w:separator/>
+      </w:r>
+    </w:p>
+  </w:footnote>
+  <w:footnote w:type="continuationSeparator" w:id="0">
+    <w:p>
+      <w:pPr>
+        <w:spacing w:before="0" w:line="240" w:lineRule="auto"/>
+      </w:pPr>
+      <w:r>
+        <w:continuationSeparator/>
+      </w:r>
+    </w:p>
+  </w:footnote>
+</w:footnotes>
 </file>
 
 <file path=word/numbering.xml><?xml version="1.0" encoding="utf-8"?>
@@ -4013,6 +4533,56 @@
       <w:shd w:val="clear" w:color="auto" w:fill="E1DFDD"/>
     </w:rPr>
   </w:style>
+  <w:style w:type="paragraph" w:styleId="Header">
+    <w:name w:val="header"/>
+    <w:basedOn w:val="Normal"/>
+    <w:link w:val="HeaderChar"/>
+    <w:uiPriority w:val="99"/>
+    <w:unhideWhenUsed/>
+    <w:rsid w:val="00161D06"/>
+    <w:pPr>
+      <w:tabs>
+        <w:tab w:val="center" w:pos="4680"/>
+        <w:tab w:val="right" w:pos="9360"/>
+      </w:tabs>
+      <w:spacing w:before="0" w:line="240" w:lineRule="auto"/>
+    </w:pPr>
+  </w:style>
+  <w:style w:type="character" w:customStyle="1" w:styleId="HeaderChar">
+    <w:name w:val="Header Char"/>
+    <w:basedOn w:val="DefaultParagraphFont"/>
+    <w:link w:val="Header"/>
+    <w:uiPriority w:val="99"/>
+    <w:rsid w:val="00161D06"/>
+    <w:rPr>
+      <w:rFonts w:eastAsiaTheme="minorEastAsia"/>
+    </w:rPr>
+  </w:style>
+  <w:style w:type="paragraph" w:styleId="Footer">
+    <w:name w:val="footer"/>
+    <w:basedOn w:val="Normal"/>
+    <w:link w:val="FooterChar"/>
+    <w:uiPriority w:val="99"/>
+    <w:unhideWhenUsed/>
+    <w:rsid w:val="00161D06"/>
+    <w:pPr>
+      <w:tabs>
+        <w:tab w:val="center" w:pos="4680"/>
+        <w:tab w:val="right" w:pos="9360"/>
+      </w:tabs>
+      <w:spacing w:before="0" w:line="240" w:lineRule="auto"/>
+    </w:pPr>
+  </w:style>
+  <w:style w:type="character" w:customStyle="1" w:styleId="FooterChar">
+    <w:name w:val="Footer Char"/>
+    <w:basedOn w:val="DefaultParagraphFont"/>
+    <w:link w:val="Footer"/>
+    <w:uiPriority w:val="99"/>
+    <w:rsid w:val="00161D06"/>
+    <w:rPr>
+      <w:rFonts w:eastAsiaTheme="minorEastAsia"/>
+    </w:rPr>
+  </w:style>
 </w:styles>
 </file>
 

</xml_diff>